<commit_message>
Refresh dunnhumby resume 80->84% with newly verified experience (EXT21)
Kshitiz confirmed real experience that legitimately closed 4 gaps -- no
fabrication: content catalogue + AI content generation (satisfies the essential
CMS OR-list), UTM/cookie lead-source attribution, audience segmentation
(grade / industry+seniority / keyword), and performance-marketing collaboration.
Expanded third-party vendor list (Daily.co, 100ms, Convin, Servetel).

Still NOT claimed: auction dynamics, ad servers/DSPs/SSPs, Retail Media domain,
microservices. In-house CDP/ops-engine claim held back pending confirmation of
his personal ownership + the 3,500+ teacher figure (logged in Open Questions).
experience_bank updated; the old catalogue/content-listing open question is
now answered.

Co-Authored-By: Claude Opus 4.8 <noreply@anthropic.com>
</commit_message>
<xml_diff>
--- a/resumes/dunnhumby-Product Manager Retail Media.docx
+++ b/resumes/dunnhumby-Product Manager Retail Media.docx
@@ -31,12 +31,12 @@
           <w:color w:val="444444"/>
           <w:sz w:val="19"/>
         </w:rPr>
-        <w:t>Product Manager  |  API-First Platform Capabilities  |  Third-Party &amp; Partner Integrations  |  Reusable Services  |  Agile Delivery</w:t>
+        <w:t>Product Manager  |  API-First Platform &amp; Partner Integrations  |  Content Catalogue &amp; CMS  |  Attribution, Targeting &amp; Funnel  |  Agile</w:t>
       </w:r>
     </w:p>
     <w:p>
       <w:pPr>
-        <w:spacing w:after="70"/>
+        <w:spacing w:after="40"/>
         <w:jc w:val="center"/>
       </w:pPr>
       <w:r>
@@ -52,7 +52,7 @@
     </w:p>
     <w:p>
       <w:pPr>
-        <w:spacing w:before="150" w:after="60"/>
+        <w:spacing w:before="120" w:after="50"/>
         <w:pBdr>
           <w:bottom w:val="single" w:sz="6" w:space="1" w:color="2E5AAC"/>
         </w:pBdr>
@@ -69,7 +69,7 @@
     </w:p>
     <w:p>
       <w:pPr>
-        <w:spacing w:after="70"/>
+        <w:spacing w:after="40"/>
       </w:pPr>
       <w:r>
         <w:rPr>
@@ -78,12 +78,12 @@
           <w:i w:val="0"/>
           <w:sz w:val="19"/>
         </w:rPr>
-        <w:t>Product Manager with 5+ years defining and delivering API-first, reusable platform capabilities and third-party integrations at a high-growth B2C platform. Owns the end-to-end lifecycle of integrations with external technology partners - 6 payment gateways (Razorpay, PayU, PayGlocal, PayPal, Bajaj), messaging (Gupshup, Venera Connect), and telephony (Exotel, Tata Tele) - acting as the primary point of contact from discovery through implementation and ongoing maintenance. Writes clear product requirements, user stories, acceptance criteria, and integration specifications, and partners closely with engineering on API contracts, data mappings, and data quality. Data-driven (SQL, Power BI) with a focus on adoption, reliability, and operational efficiency.</w:t>
+        <w:t>Product Manager with 5+ years defining and delivering API-first, reusable platform capabilities and third-party integrations at a high-growth B2C platform. Owns the end-to-end lifecycle of integrations with external technology partners - payment gateways (Razorpay, PayU, PayGlocal, PayPal, Bajaj), telephony (Exotel, Servetel, Tata Tele), live-class video (Daily.co, 100ms), video counselling and recording (Convin), and messaging (Gupshup, Venera Connect) - acting as the primary point of contact from discovery through implementation and maintenance. Built and deployed a grade- and course-wise content catalogue and automated content generation with AI. Owns lead-source attribution (UTM parameters and tracking cookies in a centralized CRM), audience segmentation and targeting, and writes clear requirements, user stories, acceptance criteria, API contracts, and integration specifications.</w:t>
       </w:r>
     </w:p>
     <w:p>
       <w:pPr>
-        <w:spacing w:before="150" w:after="60"/>
+        <w:spacing w:before="120" w:after="50"/>
         <w:pBdr>
           <w:bottom w:val="single" w:sz="6" w:space="1" w:color="2E5AAC"/>
         </w:pBdr>
@@ -128,7 +128,7 @@
     </w:p>
     <w:p>
       <w:pPr>
-        <w:spacing w:after="70"/>
+        <w:spacing w:after="40"/>
       </w:pPr>
       <w:r>
         <w:rPr>
@@ -143,7 +143,7 @@
     </w:p>
     <w:p>
       <w:pPr>
-        <w:spacing w:before="80" w:after="0"/>
+        <w:spacing w:before="70" w:after="0"/>
       </w:pPr>
       <w:r>
         <w:rPr>
@@ -153,13 +153,13 @@
           <w:color w:val="2E5AAC"/>
           <w:sz w:val="19"/>
         </w:rPr>
-        <w:t>API-First Platform &amp; Third-Party Integrations</w:t>
+        <w:t>API-First Platform &amp; Third-Party Partner Integrations</w:t>
       </w:r>
     </w:p>
     <w:p>
       <w:pPr>
         <w:pStyle w:val="ListBullet"/>
-        <w:spacing w:after="70" w:before="0" w:line="293" w:lineRule="auto"/>
+        <w:spacing w:after="40" w:before="0" w:line="254" w:lineRule="auto"/>
       </w:pPr>
       <w:r>
         <w:rPr>
@@ -168,13 +168,13 @@
           <w:i w:val="0"/>
           <w:sz w:val="19"/>
         </w:rPr>
-        <w:t>Own the lifecycle of third-party technology integrations end-to-end - 6 payment gateways via their APIs (payment creation, status verification, webhooks), messaging (Gupshup, Venera Connect), and telephony (Exotel, Tata Tele) - acting as the primary point of contact with external partners from discovery through implementation and ongoing maintenance.</w:t>
+        <w:t>Own the lifecycle of third-party technology integrations end-to-end - payment gateways via their APIs (payment creation, status verification, webhooks), telephony (Exotel, Servetel, Tata Tele), live-class video (Daily.co, 100ms), video counselling and recording (Convin), and messaging (Gupshup, Venera Connect) - acting as the primary point of contact with external partners from discovery through implementation and ongoing maintenance.</w:t>
       </w:r>
     </w:p>
     <w:p>
       <w:pPr>
         <w:pStyle w:val="ListBullet"/>
-        <w:spacing w:after="70" w:before="0" w:line="293" w:lineRule="auto"/>
+        <w:spacing w:after="40" w:before="0" w:line="254" w:lineRule="auto"/>
       </w:pPr>
       <w:r>
         <w:rPr>
@@ -183,12 +183,12 @@
           <w:i w:val="0"/>
           <w:sz w:val="19"/>
         </w:rPr>
-        <w:t>Built reusable, configurable capabilities rather than point solutions: a shared payments capability and an omnichannel support service consolidating LMS, email, WhatsApp, and chatbot channels - reused across the app, LMS, and CRM.</w:t>
+        <w:t>Built reusable, configurable capabilities rather than point solutions: a shared payments capability and an omnichannel support service consolidating LMS, email, WhatsApp, and chatbot channels, reused across the app, LMS, and CRM.</w:t>
       </w:r>
     </w:p>
     <w:p>
       <w:pPr>
-        <w:spacing w:before="80" w:after="0"/>
+        <w:spacing w:before="70" w:after="0"/>
       </w:pPr>
       <w:r>
         <w:rPr>
@@ -198,13 +198,13 @@
           <w:color w:val="2E5AAC"/>
           <w:sz w:val="19"/>
         </w:rPr>
-        <w:t>Requirements, Specifications &amp; Engineering Collaboration</w:t>
+        <w:t>Content Catalogue, Attribution &amp; Audience Targeting</w:t>
       </w:r>
     </w:p>
     <w:p>
       <w:pPr>
         <w:pStyle w:val="ListBullet"/>
-        <w:spacing w:after="70" w:before="0" w:line="293" w:lineRule="auto"/>
+        <w:spacing w:after="40" w:before="0" w:line="254" w:lineRule="auto"/>
       </w:pPr>
       <w:r>
         <w:rPr>
@@ -213,13 +213,13 @@
           <w:i w:val="0"/>
           <w:sz w:val="19"/>
         </w:rPr>
-        <w:t>Write clear product requirements, user stories, acceptance criteria, and integration specifications; partner with engineering on API contracts, data mappings, and system behaviours, including security and data quality considerations.</w:t>
+        <w:t>Built and deployed a grade-wise and course-wise content catalogue with the content team - surfaced by learner choice and teacher recommendation - then automated content generation with AI prompts, removing the manual content-team effort previously required.</w:t>
       </w:r>
     </w:p>
     <w:p>
       <w:pPr>
         <w:pStyle w:val="ListBullet"/>
-        <w:spacing w:after="70" w:before="0" w:line="293" w:lineRule="auto"/>
+        <w:spacing w:after="40" w:before="0" w:line="254" w:lineRule="auto"/>
       </w:pPr>
       <w:r>
         <w:rPr>
@@ -228,12 +228,27 @@
           <w:i w:val="0"/>
           <w:sz w:val="19"/>
         </w:rPr>
-        <w:t>Replaced a third-party video platform with a resilient in-house one and automated backend workflows (manual punching 100% to 2%), improving reliability, consistency, and operational efficiency while saving Rs 1.6L/month.</w:t>
+        <w:t>Own lead-source attribution in a centralized CRM: inbound leads auto-tagged via UTM parameters and tracking cookies on form submission, outbound leads uploaded or entered by counselors; partnered with Marketing and Sales to optimise lead flow, lead acceptance, and best-performing sources.</w:t>
       </w:r>
     </w:p>
     <w:p>
       <w:pPr>
-        <w:spacing w:before="80" w:after="0"/>
+        <w:pStyle w:val="ListBullet"/>
+        <w:spacing w:after="40" w:before="0" w:line="254" w:lineRule="auto"/>
+      </w:pPr>
+      <w:r>
+        <w:rPr>
+          <w:rFonts w:ascii="Calibri" w:hAnsi="Calibri"/>
+          <w:b w:val="0"/>
+          <w:i w:val="0"/>
+          <w:sz w:val="19"/>
+        </w:rPr>
+        <w:t>Drove audience segmentation and targeting - personalised course plans by learner grade, professional segments by industry and seniority, and keyword targeting on the highest-volume customer search terms.</w:t>
+      </w:r>
+    </w:p>
+    <w:p>
+      <w:pPr>
+        <w:spacing w:before="70" w:after="0"/>
       </w:pPr>
       <w:r>
         <w:rPr>
@@ -243,13 +258,13 @@
           <w:color w:val="2E5AAC"/>
           <w:sz w:val="19"/>
         </w:rPr>
-        <w:t>Adoption, Data &amp; Commercial Value</w:t>
+        <w:t>Specifications, Adoption &amp; Commercial Value</w:t>
       </w:r>
     </w:p>
     <w:p>
       <w:pPr>
         <w:pStyle w:val="ListBullet"/>
-        <w:spacing w:after="70" w:before="0" w:line="293" w:lineRule="auto"/>
+        <w:spacing w:after="40" w:before="0" w:line="254" w:lineRule="auto"/>
       </w:pPr>
       <w:r>
         <w:rPr>
@@ -258,13 +273,13 @@
           <w:i w:val="0"/>
           <w:sz w:val="19"/>
         </w:rPr>
-        <w:t>Measure adoption and operational performance with SQL and Power BI dashboards for Marketing, Sales, and Operations, monitoring data quality and catching discrepancies across systems.</w:t>
+        <w:t>Write clear product requirements, user stories, acceptance criteria, and integration specifications; partner with engineering on API contracts, data schemas, and system behaviours, including security and data quality; measure adoption and reliability via SQL and Power BI dashboards.</w:t>
       </w:r>
     </w:p>
     <w:p>
       <w:pPr>
         <w:pStyle w:val="ListBullet"/>
-        <w:spacing w:after="70" w:before="0" w:line="293" w:lineRule="auto"/>
+        <w:spacing w:after="40" w:before="0" w:line="254" w:lineRule="auto"/>
       </w:pPr>
       <w:r>
         <w:rPr>
@@ -273,12 +288,12 @@
           <w:i w:val="0"/>
           <w:sz w:val="19"/>
         </w:rPr>
-        <w:t>Prioritise and deliver large, ambiguous initiatives that create commercial value - re-architected the sign-up to enrolment funnel and shipped monetization and renewal capabilities driving 20% revenue growth, 25% ARPU expansion, and Rs 70L in renewals in a single month.</w:t>
+        <w:t>Prioritise and deliver large, ambiguous initiatives creating commercial value - re-architected the sign-up to enrolment funnel and shipped monetization and renewal capabilities driving 20% revenue growth, 25% ARPU expansion, and Rs 70L in renewals in a single month.</w:t>
       </w:r>
     </w:p>
     <w:p>
       <w:pPr>
-        <w:spacing w:before="150" w:after="60"/>
+        <w:spacing w:before="120" w:after="50"/>
         <w:pBdr>
           <w:bottom w:val="single" w:sz="6" w:space="1" w:color="2E5AAC"/>
         </w:pBdr>
@@ -295,7 +310,7 @@
     </w:p>
     <w:p>
       <w:pPr>
-        <w:spacing w:after="70"/>
+        <w:spacing w:after="40"/>
       </w:pPr>
       <w:r>
         <w:rPr>
@@ -304,12 +319,12 @@
           <w:i w:val="0"/>
           <w:sz w:val="19"/>
         </w:rPr>
-        <w:t>API-First Platform Capabilities · Third-Party &amp; Partner Integrations (lifecycle owner) · Reusable Capabilities &amp; Configurable Integration Patterns · Integration Specifications, API Contracts &amp; Data Mappings · Product Requirements, User Stories &amp; Acceptance Criteria · Execution Roadmap &amp; Prioritisation · Adoption, Reliability &amp; Operational Metrics · Data Quality &amp; Observability · Business and Technical Stakeholder Management · Cross-Functional Agile Delivery (Engineering, Design, Operations) · SQL &amp; BI · Platform-First Thinking</w:t>
+        <w:t>API-First Platform Capabilities · Third-Party &amp; Partner Integrations (lifecycle owner) · Reusable Capabilities &amp; Configurable Integration Patterns · Content Catalogue &amp; Content Management · Attribution &amp; Lead-Source Tracking (UTM, Cookies, CRM) · Audience Segmentation &amp; Targeting · Campaign Performance &amp; Funnel Optimisation · Integration Specifications, API Contracts, Webhooks &amp; Data Schemas · Product Requirements, User Stories &amp; Acceptance Criteria · Adoption, Reliability &amp; Data Quality Metrics · Business and Technical Stakeholder Management · Cross-Functional Agile Delivery · Execution Roadmap &amp; Prioritisation · SQL &amp; BI</w:t>
       </w:r>
     </w:p>
     <w:p>
       <w:pPr>
-        <w:spacing w:before="150" w:after="60"/>
+        <w:spacing w:before="120" w:after="50"/>
         <w:pBdr>
           <w:bottom w:val="single" w:sz="6" w:space="1" w:color="2E5AAC"/>
         </w:pBdr>
@@ -327,7 +342,7 @@
     <w:p>
       <w:pPr>
         <w:pStyle w:val="ListBullet"/>
-        <w:spacing w:after="70" w:before="0" w:line="293" w:lineRule="auto"/>
+        <w:spacing w:after="40" w:before="0" w:line="254" w:lineRule="auto"/>
       </w:pPr>
       <w:r>
         <w:rPr>
@@ -345,13 +360,13 @@
           <w:i w:val="0"/>
           <w:sz w:val="19"/>
         </w:rPr>
-        <w:t>REST APIs, webhooks, API contracts, data mappings, third-party system integration</w:t>
+        <w:t>REST APIs, webhooks, API contracts, data schemas, data mappings, third-party system integration</w:t>
       </w:r>
     </w:p>
     <w:p>
       <w:pPr>
         <w:pStyle w:val="ListBullet"/>
-        <w:spacing w:after="70" w:before="0" w:line="293" w:lineRule="auto"/>
+        <w:spacing w:after="40" w:before="0" w:line="254" w:lineRule="auto"/>
       </w:pPr>
       <w:r>
         <w:rPr>
@@ -369,13 +384,13 @@
           <w:i w:val="0"/>
           <w:sz w:val="19"/>
         </w:rPr>
-        <w:t>SQL, Power BI, Metabase, GA4, MS Excel (Advanced)</w:t>
+        <w:t>SQL, Power BI, Metabase, GA4, UTM and cookie-based attribution, MS Excel (Advanced)</w:t>
       </w:r>
     </w:p>
     <w:p>
       <w:pPr>
         <w:pStyle w:val="ListBullet"/>
-        <w:spacing w:after="70" w:before="0" w:line="293" w:lineRule="auto"/>
+        <w:spacing w:after="40" w:before="0" w:line="254" w:lineRule="auto"/>
       </w:pPr>
       <w:r>
         <w:rPr>
@@ -399,7 +414,7 @@
     <w:p>
       <w:pPr>
         <w:pStyle w:val="ListBullet"/>
-        <w:spacing w:after="70" w:before="0" w:line="293" w:lineRule="auto"/>
+        <w:spacing w:after="40" w:before="0" w:line="254" w:lineRule="auto"/>
       </w:pPr>
       <w:r>
         <w:rPr>
@@ -417,12 +432,12 @@
           <w:i w:val="0"/>
           <w:sz w:val="19"/>
         </w:rPr>
-        <w:t>OpenAI / Gemini / Claude APIs, Prompt Engineering, Figma</w:t>
+        <w:t>OpenAI / Gemini / Claude APIs, Prompt Engineering, AI-automated content generation, Figma</w:t>
       </w:r>
     </w:p>
     <w:p>
       <w:pPr>
-        <w:spacing w:before="150" w:after="60"/>
+        <w:spacing w:before="120" w:after="50"/>
         <w:pBdr>
           <w:bottom w:val="single" w:sz="6" w:space="1" w:color="2E5AAC"/>
         </w:pBdr>
@@ -442,7 +457,7 @@
         <w:tabs>
           <w:tab w:pos="10546" w:val="right"/>
         </w:tabs>
-        <w:spacing w:after="70"/>
+        <w:spacing w:after="40"/>
       </w:pPr>
       <w:r>
         <w:rPr>
@@ -470,7 +485,7 @@
         <w:tabs>
           <w:tab w:pos="10546" w:val="right"/>
         </w:tabs>
-        <w:spacing w:after="70"/>
+        <w:spacing w:after="40"/>
       </w:pPr>
       <w:r>
         <w:rPr>
@@ -495,7 +510,7 @@
     </w:p>
     <w:p>
       <w:pPr>
-        <w:spacing w:before="150" w:after="60"/>
+        <w:spacing w:before="120" w:after="50"/>
         <w:pBdr>
           <w:bottom w:val="single" w:sz="6" w:space="1" w:color="2E5AAC"/>
         </w:pBdr>
@@ -513,7 +528,7 @@
     <w:p>
       <w:pPr>
         <w:pStyle w:val="ListBullet"/>
-        <w:spacing w:after="70" w:before="0" w:line="293" w:lineRule="auto"/>
+        <w:spacing w:after="40" w:before="0" w:line="254" w:lineRule="auto"/>
       </w:pPr>
       <w:r>
         <w:rPr>
@@ -899,7 +914,7 @@
     <w:qFormat/>
     <w:rsid w:val="00FC693F"/>
     <w:pPr>
-      <w:spacing w:after="70" w:before="0" w:line="293" w:lineRule="auto"/>
+      <w:spacing w:after="40" w:before="0" w:line="254" w:lineRule="auto"/>
     </w:pPr>
     <w:rPr>
       <w:rFonts w:ascii="Calibri" w:hAnsi="Calibri"/>
@@ -1432,7 +1447,7 @@
       <w:numPr>
         <w:numId w:val="1"/>
       </w:numPr>
-      <w:spacing w:after="70" w:before="0" w:line="293" w:lineRule="auto"/>
+      <w:spacing w:after="40" w:before="0" w:line="254" w:lineRule="auto"/>
       <w:contextualSpacing/>
     </w:pPr>
     <w:rPr>

</xml_diff>